<commit_message>
Update resume content for internship CV
</commit_message>
<xml_diff>
--- a/梁博一-实习简历.docx
+++ b/梁博一-实习简历.docx
@@ -12,14 +12,14 @@
           <w:rFonts w:ascii="Calibri" w:hAnsi="Calibri" w:eastAsia="Hiragino Sans GB W3" w:cs="Calibri"/>
           <w:b/>
           <w:color w:val="0B2545"/>
-          <w:sz w:val="42"/>
+          <w:sz w:val="38"/>
         </w:rPr>
         <w:t>梁博一</w:t>
       </w:r>
     </w:p>
     <w:p>
       <w:pPr>
-        <w:spacing w:before="0" w:after="80" w:line="264" w:lineRule="auto"/>
+        <w:spacing w:before="0" w:after="40" w:line="264" w:lineRule="auto"/>
         <w:jc w:val="center"/>
       </w:pPr>
       <w:r>
@@ -34,7 +34,7 @@
     </w:p>
     <w:p>
       <w:pPr>
-        <w:spacing w:before="0" w:after="200" w:line="264" w:lineRule="auto"/>
+        <w:spacing w:before="0" w:after="120" w:line="264" w:lineRule="auto"/>
         <w:jc w:val="center"/>
       </w:pPr>
       <w:r>
@@ -42,7 +42,7 @@
           <w:rFonts w:ascii="Calibri" w:hAnsi="Calibri" w:eastAsia="Hiragino Sans GB W3" w:cs="Calibri"/>
           <w:b w:val="0"/>
           <w:color w:val="595959"/>
-          <w:sz w:val="19"/>
+          <w:sz w:val="17"/>
         </w:rPr>
         <w:t>城市：深圳</w:t>
       </w:r>
@@ -51,7 +51,7 @@
           <w:rFonts w:ascii="Calibri" w:hAnsi="Calibri" w:eastAsia="Hiragino Sans GB W3" w:cs="Calibri"/>
           <w:b w:val="0"/>
           <w:color w:val="595959"/>
-          <w:sz w:val="19"/>
+          <w:sz w:val="17"/>
         </w:rPr>
         <w:t xml:space="preserve">  |  </w:t>
       </w:r>
@@ -60,7 +60,7 @@
           <w:rFonts w:ascii="Calibri" w:hAnsi="Calibri" w:eastAsia="Hiragino Sans GB W3" w:cs="Calibri"/>
           <w:b w:val="0"/>
           <w:color w:val="595959"/>
-          <w:sz w:val="19"/>
+          <w:sz w:val="17"/>
         </w:rPr>
         <w:t>手机：18859047927</w:t>
       </w:r>
@@ -69,7 +69,7 @@
           <w:rFonts w:ascii="Calibri" w:hAnsi="Calibri" w:eastAsia="Hiragino Sans GB W3" w:cs="Calibri"/>
           <w:b w:val="0"/>
           <w:color w:val="595959"/>
-          <w:sz w:val="19"/>
+          <w:sz w:val="17"/>
         </w:rPr>
         <w:t xml:space="preserve">  |  </w:t>
       </w:r>
@@ -89,7 +89,7 @@
           <w:rFonts w:ascii="Calibri" w:hAnsi="Calibri" w:eastAsia="Hiragino Sans GB W3" w:cs="Calibri"/>
           <w:b w:val="0"/>
           <w:color w:val="595959"/>
-          <w:sz w:val="19"/>
+          <w:sz w:val="17"/>
         </w:rPr>
         <w:t xml:space="preserve">  |  </w:t>
       </w:r>
@@ -109,7 +109,7 @@
           <w:rFonts w:ascii="Calibri" w:hAnsi="Calibri" w:eastAsia="Hiragino Sans GB W3" w:cs="Calibri"/>
           <w:b w:val="0"/>
           <w:color w:val="595959"/>
-          <w:sz w:val="19"/>
+          <w:sz w:val="17"/>
         </w:rPr>
         <w:t xml:space="preserve">  |  </w:t>
       </w:r>
@@ -128,7 +128,7 @@
     <w:p>
       <w:pPr>
         <w:keepNext/>
-        <w:spacing w:before="200" w:after="80" w:line="264" w:lineRule="auto"/>
+        <w:spacing w:before="120" w:after="40" w:line="264" w:lineRule="auto"/>
         <w:pBdr>
           <w:bottom w:val="single" w:sz="6" w:space="1" w:color="D9E2F3"/>
         </w:pBdr>
@@ -138,7 +138,7 @@
           <w:rFonts w:ascii="Calibri" w:hAnsi="Calibri" w:eastAsia="Hiragino Sans GB W3" w:cs="Calibri"/>
           <w:b/>
           <w:color w:val="2E74B5"/>
-          <w:sz w:val="26"/>
+          <w:sz w:val="23"/>
         </w:rPr>
         <w:t>个人简介</w:t>
       </w:r>
@@ -152,15 +152,15 @@
           <w:rFonts w:ascii="Calibri" w:hAnsi="Calibri" w:eastAsia="Hiragino Sans GB W3" w:cs="Calibri"/>
           <w:b w:val="0"/>
           <w:color w:val="202020"/>
-          <w:sz w:val="19"/>
+          <w:sz w:val="18"/>
         </w:rPr>
-        <w:t>深圳北理莫斯科大学数学与物理专业本科生，2024 级大二，预计 2028 年毕业。正在系统学习 Python 编程、AI 应用开发、RAG、Agent 开发与 GitHub 项目开发。已独立完成并部署 AI PDF 工具、Canvas 横版小游戏和数据可视化全栈应用，希望在实习中继续提升工程能力、AI 应用开发能力和产品落地能力。</w:t>
+        <w:t>深圳北理莫斯科大学数学与物理专业本科生，2024 级大二，预计 2028 年毕业。正在系统学习 Python 编程、AI 应用开发、RAG、Agent 开发与 GitHub 项目开发。已独立完成并部署 AI PDF 工具、Canvas 横版小游戏和数据可视化全栈应用。</w:t>
       </w:r>
     </w:p>
     <w:p>
       <w:pPr>
         <w:keepNext/>
-        <w:spacing w:before="200" w:after="80" w:line="264" w:lineRule="auto"/>
+        <w:spacing w:before="120" w:after="40" w:line="264" w:lineRule="auto"/>
         <w:pBdr>
           <w:bottom w:val="single" w:sz="6" w:space="1" w:color="D9E2F3"/>
         </w:pBdr>
@@ -170,7 +170,7 @@
           <w:rFonts w:ascii="Calibri" w:hAnsi="Calibri" w:eastAsia="Hiragino Sans GB W3" w:cs="Calibri"/>
           <w:b/>
           <w:color w:val="2E74B5"/>
-          <w:sz w:val="26"/>
+          <w:sz w:val="23"/>
         </w:rPr>
         <w:t>教育经历</w:t>
       </w:r>
@@ -195,13 +195,13 @@
           <w:color w:val="202020"/>
           <w:sz w:val="19"/>
         </w:rPr>
-        <w:t xml:space="preserve">  |  数学与物理专业 本科  |  2024 级 大二，预计 2028 年毕业</w:t>
+        <w:t xml:space="preserve">  |  数学与物理专业 本科  |  2024 级 大二，预计 2028 年毕业  |  GPA：3.66（满分 4.0）</w:t>
       </w:r>
     </w:p>
     <w:p>
       <w:pPr>
         <w:pStyle w:val="ListBullet"/>
-        <w:spacing w:before="0" w:after="60" w:line="269" w:lineRule="auto"/>
+        <w:spacing w:before="0" w:after="24" w:line="245" w:lineRule="auto"/>
         <w:ind w:left="360" w:hanging="173"/>
       </w:pPr>
       <w:r>
@@ -209,7 +209,7 @@
           <w:rFonts w:ascii="Calibri" w:hAnsi="Calibri" w:eastAsia="Hiragino Sans GB W3" w:cs="Calibri"/>
           <w:b w:val="0"/>
           <w:color w:val="202020"/>
-          <w:sz w:val="19"/>
+          <w:sz w:val="17"/>
         </w:rPr>
         <w:t>相关基础：数学分析、高等代数、概率统计、物理建模、编程基础等。</w:t>
       </w:r>
@@ -217,7 +217,7 @@
     <w:p>
       <w:pPr>
         <w:pStyle w:val="ListBullet"/>
-        <w:spacing w:before="0" w:after="60" w:line="269" w:lineRule="auto"/>
+        <w:spacing w:before="0" w:after="24" w:line="245" w:lineRule="auto"/>
         <w:ind w:left="360" w:hanging="173"/>
       </w:pPr>
       <w:r>
@@ -225,7 +225,7 @@
           <w:rFonts w:ascii="Calibri" w:hAnsi="Calibri" w:eastAsia="Hiragino Sans GB W3" w:cs="Calibri"/>
           <w:b w:val="0"/>
           <w:color w:val="202020"/>
-          <w:sz w:val="19"/>
+          <w:sz w:val="17"/>
         </w:rPr>
         <w:t>重点方向：AI 应用开发、Python 编程、数据分析、Web 项目开发。</w:t>
       </w:r>
@@ -233,7 +233,7 @@
     <w:p>
       <w:pPr>
         <w:keepNext/>
-        <w:spacing w:before="200" w:after="80" w:line="264" w:lineRule="auto"/>
+        <w:spacing w:before="120" w:after="40" w:line="264" w:lineRule="auto"/>
         <w:pBdr>
           <w:bottom w:val="single" w:sz="6" w:space="1" w:color="D9E2F3"/>
         </w:pBdr>
@@ -243,7 +243,7 @@
           <w:rFonts w:ascii="Calibri" w:hAnsi="Calibri" w:eastAsia="Hiragino Sans GB W3" w:cs="Calibri"/>
           <w:b/>
           <w:color w:val="2E74B5"/>
-          <w:sz w:val="26"/>
+          <w:sz w:val="23"/>
         </w:rPr>
         <w:t>技能</w:t>
       </w:r>
@@ -251,7 +251,7 @@
     <w:p>
       <w:pPr>
         <w:pStyle w:val="ListBullet"/>
-        <w:spacing w:before="0" w:after="60" w:line="269" w:lineRule="auto"/>
+        <w:spacing w:before="0" w:after="24" w:line="245" w:lineRule="auto"/>
         <w:ind w:left="360" w:hanging="173"/>
       </w:pPr>
       <w:r>
@@ -259,7 +259,7 @@
           <w:rFonts w:ascii="Calibri" w:hAnsi="Calibri" w:eastAsia="Hiragino Sans GB W3" w:cs="Calibri"/>
           <w:b w:val="0"/>
           <w:color w:val="202020"/>
-          <w:sz w:val="19"/>
+          <w:sz w:val="17"/>
         </w:rPr>
         <w:t>编程语言：Python、JavaScript、HTML、CSS</w:t>
       </w:r>
@@ -267,7 +267,7 @@
     <w:p>
       <w:pPr>
         <w:pStyle w:val="ListBullet"/>
-        <w:spacing w:before="0" w:after="60" w:line="269" w:lineRule="auto"/>
+        <w:spacing w:before="0" w:after="24" w:line="245" w:lineRule="auto"/>
         <w:ind w:left="360" w:hanging="173"/>
       </w:pPr>
       <w:r>
@@ -275,15 +275,15 @@
           <w:rFonts w:ascii="Calibri" w:hAnsi="Calibri" w:eastAsia="Hiragino Sans GB W3" w:cs="Calibri"/>
           <w:b w:val="0"/>
           <w:color w:val="202020"/>
-          <w:sz w:val="19"/>
+          <w:sz w:val="17"/>
         </w:rPr>
-        <w:t>AI 应用：AI 应用开发、RAG 基础、Agent 开发基础、Streamlit</w:t>
+        <w:t>AI 应用：Streamlit、AI 应用开发、RAG 基础</w:t>
       </w:r>
     </w:p>
     <w:p>
       <w:pPr>
         <w:pStyle w:val="ListBullet"/>
-        <w:spacing w:before="0" w:after="60" w:line="269" w:lineRule="auto"/>
+        <w:spacing w:before="0" w:after="24" w:line="245" w:lineRule="auto"/>
         <w:ind w:left="360" w:hanging="173"/>
       </w:pPr>
       <w:r>
@@ -291,15 +291,15 @@
           <w:rFonts w:ascii="Calibri" w:hAnsi="Calibri" w:eastAsia="Hiragino Sans GB W3" w:cs="Calibri"/>
           <w:b w:val="0"/>
           <w:color w:val="202020"/>
-          <w:sz w:val="19"/>
+          <w:sz w:val="17"/>
         </w:rPr>
-        <w:t>Web 开发：Vue 3、Vite、Flask、Canvas、响应式页面开发</w:t>
+        <w:t>Web 与可视化：Canvas、ECharts、Vue 3 / Flask 项目实践</w:t>
       </w:r>
     </w:p>
     <w:p>
       <w:pPr>
         <w:pStyle w:val="ListBullet"/>
-        <w:spacing w:before="0" w:after="60" w:line="269" w:lineRule="auto"/>
+        <w:spacing w:before="0" w:after="24" w:line="245" w:lineRule="auto"/>
         <w:ind w:left="360" w:hanging="173"/>
       </w:pPr>
       <w:r>
@@ -307,47 +307,15 @@
           <w:rFonts w:ascii="Calibri" w:hAnsi="Calibri" w:eastAsia="Hiragino Sans GB W3" w:cs="Calibri"/>
           <w:b w:val="0"/>
           <w:color w:val="202020"/>
-          <w:sz w:val="19"/>
+          <w:sz w:val="17"/>
         </w:rPr>
-        <w:t>数据与可视化：ECharts、SQLite、CSV/Excel 数据处理、基础数据分析</w:t>
-      </w:r>
-    </w:p>
-    <w:p>
-      <w:pPr>
-        <w:pStyle w:val="ListBullet"/>
-        <w:spacing w:before="0" w:after="60" w:line="269" w:lineRule="auto"/>
-        <w:ind w:left="360" w:hanging="173"/>
-      </w:pPr>
-      <w:r>
-        <w:rPr>
-          <w:rFonts w:ascii="Calibri" w:hAnsi="Calibri" w:eastAsia="Hiragino Sans GB W3" w:cs="Calibri"/>
-          <w:b w:val="0"/>
-          <w:color w:val="202020"/>
-          <w:sz w:val="19"/>
-        </w:rPr>
-        <w:t>工程工具：Git、GitHub、Docker、Gunicorn、Render、GitHub Actions</w:t>
-      </w:r>
-    </w:p>
-    <w:p>
-      <w:pPr>
-        <w:pStyle w:val="ListBullet"/>
-        <w:spacing w:before="0" w:after="60" w:line="269" w:lineRule="auto"/>
-        <w:ind w:left="360" w:hanging="173"/>
-      </w:pPr>
-      <w:r>
-        <w:rPr>
-          <w:rFonts w:ascii="Calibri" w:hAnsi="Calibri" w:eastAsia="Hiragino Sans GB W3" w:cs="Calibri"/>
-          <w:b w:val="0"/>
-          <w:color w:val="202020"/>
-          <w:sz w:val="19"/>
-        </w:rPr>
-        <w:t>其他：机器学习基础、数学与物理建模思维</w:t>
+        <w:t>工程工具：Git、GitHub、Render / GitHub Pages 部署实践</w:t>
       </w:r>
     </w:p>
     <w:p>
       <w:pPr>
         <w:keepNext/>
-        <w:spacing w:before="200" w:after="80" w:line="264" w:lineRule="auto"/>
+        <w:spacing w:before="120" w:after="40" w:line="264" w:lineRule="auto"/>
         <w:pBdr>
           <w:bottom w:val="single" w:sz="6" w:space="1" w:color="D9E2F3"/>
         </w:pBdr>
@@ -357,7 +325,7 @@
           <w:rFonts w:ascii="Calibri" w:hAnsi="Calibri" w:eastAsia="Hiragino Sans GB W3" w:cs="Calibri"/>
           <w:b/>
           <w:color w:val="2E74B5"/>
-          <w:sz w:val="26"/>
+          <w:sz w:val="23"/>
         </w:rPr>
         <w:t>项目经历</w:t>
       </w:r>
@@ -365,28 +333,28 @@
     <w:p>
       <w:pPr>
         <w:keepNext/>
-        <w:spacing w:before="120" w:after="40" w:line="264" w:lineRule="auto"/>
+        <w:spacing w:before="60" w:after="20" w:line="264" w:lineRule="auto"/>
       </w:pPr>
       <w:r>
         <w:rPr>
           <w:rFonts w:ascii="Calibri" w:hAnsi="Calibri" w:eastAsia="Hiragino Sans GB W3" w:cs="Calibri"/>
           <w:b/>
           <w:color w:val="1F4D78"/>
-          <w:sz w:val="22"/>
+          <w:sz w:val="20"/>
         </w:rPr>
         <w:t>AI PDF 知识助手</w:t>
       </w:r>
     </w:p>
     <w:p>
       <w:pPr>
-        <w:spacing w:before="0" w:after="40" w:line="252" w:lineRule="auto"/>
+        <w:spacing w:before="0" w:after="20" w:line="240" w:lineRule="auto"/>
       </w:pPr>
       <w:r>
         <w:rPr>
           <w:rFonts w:ascii="Calibri" w:hAnsi="Calibri" w:eastAsia="Hiragino Sans GB W3" w:cs="Calibri"/>
           <w:b/>
           <w:color w:val="595959"/>
-          <w:sz w:val="18"/>
+          <w:sz w:val="16"/>
         </w:rPr>
         <w:t>链接：</w:t>
       </w:r>
@@ -406,7 +374,7 @@
           <w:rFonts w:ascii="Calibri" w:hAnsi="Calibri" w:eastAsia="Hiragino Sans GB W3" w:cs="Calibri"/>
           <w:b w:val="0"/>
           <w:color w:val="595959"/>
-          <w:sz w:val="18"/>
+          <w:sz w:val="16"/>
         </w:rPr>
         <w:t xml:space="preserve">  |  </w:t>
       </w:r>
@@ -424,14 +392,14 @@
     </w:p>
     <w:p>
       <w:pPr>
-        <w:spacing w:before="0" w:after="40" w:line="252" w:lineRule="auto"/>
+        <w:spacing w:before="0" w:after="20" w:line="240" w:lineRule="auto"/>
       </w:pPr>
       <w:r>
         <w:rPr>
           <w:rFonts w:ascii="Calibri" w:hAnsi="Calibri" w:eastAsia="Hiragino Sans GB W3" w:cs="Calibri"/>
           <w:b/>
           <w:color w:val="595959"/>
-          <w:sz w:val="18"/>
+          <w:sz w:val="16"/>
         </w:rPr>
         <w:t>技术栈：</w:t>
       </w:r>
@@ -440,21 +408,21 @@
           <w:rFonts w:ascii="Calibri" w:hAnsi="Calibri" w:eastAsia="Hiragino Sans GB W3" w:cs="Calibri"/>
           <w:b w:val="0"/>
           <w:color w:val="595959"/>
-          <w:sz w:val="18"/>
+          <w:sz w:val="16"/>
         </w:rPr>
         <w:t>Python、Streamlit</w:t>
       </w:r>
     </w:p>
     <w:p>
       <w:pPr>
-        <w:spacing w:before="0" w:after="60" w:line="259" w:lineRule="auto"/>
+        <w:spacing w:before="0" w:after="30" w:line="245" w:lineRule="auto"/>
       </w:pPr>
       <w:r>
         <w:rPr>
           <w:rFonts w:ascii="Calibri" w:hAnsi="Calibri" w:eastAsia="Hiragino Sans GB W3" w:cs="Calibri"/>
           <w:b w:val="0"/>
           <w:color w:val="202020"/>
-          <w:sz w:val="19"/>
+          <w:sz w:val="17"/>
         </w:rPr>
         <w:t>支持上传 PDF 并进行智能检索的 AI 工具，面向文档阅读、资料查询和知识问答场景。</w:t>
       </w:r>
@@ -462,7 +430,7 @@
     <w:p>
       <w:pPr>
         <w:pStyle w:val="ListBullet"/>
-        <w:spacing w:before="0" w:after="60" w:line="269" w:lineRule="auto"/>
+        <w:spacing w:before="0" w:after="24" w:line="245" w:lineRule="auto"/>
         <w:ind w:left="360" w:hanging="173"/>
       </w:pPr>
       <w:r>
@@ -470,7 +438,7 @@
           <w:rFonts w:ascii="Calibri" w:hAnsi="Calibri" w:eastAsia="Hiragino Sans GB W3" w:cs="Calibri"/>
           <w:b w:val="0"/>
           <w:color w:val="202020"/>
-          <w:sz w:val="19"/>
+          <w:sz w:val="17"/>
         </w:rPr>
         <w:t>使用 Streamlit 搭建 Web 交互界面，实现 PDF 上传与检索结果展示。</w:t>
       </w:r>
@@ -478,7 +446,7 @@
     <w:p>
       <w:pPr>
         <w:pStyle w:val="ListBullet"/>
-        <w:spacing w:before="0" w:after="60" w:line="269" w:lineRule="auto"/>
+        <w:spacing w:before="0" w:after="24" w:line="245" w:lineRule="auto"/>
         <w:ind w:left="360" w:hanging="173"/>
       </w:pPr>
       <w:r>
@@ -486,68 +454,36 @@
           <w:rFonts w:ascii="Calibri" w:hAnsi="Calibri" w:eastAsia="Hiragino Sans GB W3" w:cs="Calibri"/>
           <w:b w:val="0"/>
           <w:color w:val="202020"/>
-          <w:sz w:val="19"/>
-        </w:rPr>
-        <w:t>围绕 PDF 文档信息检索流程进行功能设计，提升用户查询资料的效率。</w:t>
-      </w:r>
-    </w:p>
-    <w:p>
-      <w:pPr>
-        <w:pStyle w:val="ListBullet"/>
-        <w:spacing w:before="0" w:after="60" w:line="269" w:lineRule="auto"/>
-        <w:ind w:left="360" w:hanging="173"/>
-      </w:pPr>
-      <w:r>
-        <w:rPr>
-          <w:rFonts w:ascii="Calibri" w:hAnsi="Calibri" w:eastAsia="Hiragino Sans GB W3" w:cs="Calibri"/>
-          <w:b w:val="0"/>
-          <w:color w:val="202020"/>
-          <w:sz w:val="19"/>
+          <w:sz w:val="17"/>
         </w:rPr>
         <w:t>将项目部署到线上演示环境，并通过 GitHub 管理项目代码。</w:t>
       </w:r>
     </w:p>
     <w:p>
       <w:pPr>
-        <w:pStyle w:val="ListBullet"/>
-        <w:spacing w:before="0" w:after="60" w:line="269" w:lineRule="auto"/>
-        <w:ind w:left="360" w:hanging="173"/>
-      </w:pPr>
-      <w:r>
-        <w:rPr>
-          <w:rFonts w:ascii="Calibri" w:hAnsi="Calibri" w:eastAsia="Hiragino Sans GB W3" w:cs="Calibri"/>
-          <w:b w:val="0"/>
-          <w:color w:val="202020"/>
-          <w:sz w:val="19"/>
-        </w:rPr>
-        <w:t>熟悉了 Python Web 小工具从功能设计、代码实现到线上部署的完整流程。</w:t>
-      </w:r>
-    </w:p>
-    <w:p>
-      <w:pPr>
         <w:keepNext/>
-        <w:spacing w:before="120" w:after="40" w:line="264" w:lineRule="auto"/>
+        <w:spacing w:before="60" w:after="20" w:line="264" w:lineRule="auto"/>
       </w:pPr>
       <w:r>
         <w:rPr>
           <w:rFonts w:ascii="Calibri" w:hAnsi="Calibri" w:eastAsia="Hiragino Sans GB W3" w:cs="Calibri"/>
           <w:b/>
           <w:color w:val="1F4D78"/>
-          <w:sz w:val="22"/>
+          <w:sz w:val="20"/>
         </w:rPr>
         <w:t>小猪大冒险</w:t>
       </w:r>
     </w:p>
     <w:p>
       <w:pPr>
-        <w:spacing w:before="0" w:after="40" w:line="252" w:lineRule="auto"/>
+        <w:spacing w:before="0" w:after="20" w:line="240" w:lineRule="auto"/>
       </w:pPr>
       <w:r>
         <w:rPr>
           <w:rFonts w:ascii="Calibri" w:hAnsi="Calibri" w:eastAsia="Hiragino Sans GB W3" w:cs="Calibri"/>
           <w:b/>
           <w:color w:val="595959"/>
-          <w:sz w:val="18"/>
+          <w:sz w:val="16"/>
         </w:rPr>
         <w:t>链接：</w:t>
       </w:r>
@@ -567,7 +503,7 @@
           <w:rFonts w:ascii="Calibri" w:hAnsi="Calibri" w:eastAsia="Hiragino Sans GB W3" w:cs="Calibri"/>
           <w:b w:val="0"/>
           <w:color w:val="595959"/>
-          <w:sz w:val="18"/>
+          <w:sz w:val="16"/>
         </w:rPr>
         <w:t xml:space="preserve">  |  </w:t>
       </w:r>
@@ -585,14 +521,14 @@
     </w:p>
     <w:p>
       <w:pPr>
-        <w:spacing w:before="0" w:after="40" w:line="252" w:lineRule="auto"/>
+        <w:spacing w:before="0" w:after="20" w:line="240" w:lineRule="auto"/>
       </w:pPr>
       <w:r>
         <w:rPr>
           <w:rFonts w:ascii="Calibri" w:hAnsi="Calibri" w:eastAsia="Hiragino Sans GB W3" w:cs="Calibri"/>
           <w:b/>
           <w:color w:val="595959"/>
-          <w:sz w:val="18"/>
+          <w:sz w:val="16"/>
         </w:rPr>
         <w:t>技术栈：</w:t>
       </w:r>
@@ -601,21 +537,21 @@
           <w:rFonts w:ascii="Calibri" w:hAnsi="Calibri" w:eastAsia="Hiragino Sans GB W3" w:cs="Calibri"/>
           <w:b w:val="0"/>
           <w:color w:val="595959"/>
-          <w:sz w:val="18"/>
+          <w:sz w:val="16"/>
         </w:rPr>
         <w:t>HTML、CSS、JavaScript、Canvas</w:t>
       </w:r>
     </w:p>
     <w:p>
       <w:pPr>
-        <w:spacing w:before="0" w:after="60" w:line="259" w:lineRule="auto"/>
+        <w:spacing w:before="0" w:after="30" w:line="245" w:lineRule="auto"/>
       </w:pPr>
       <w:r>
         <w:rPr>
           <w:rFonts w:ascii="Calibri" w:hAnsi="Calibri" w:eastAsia="Hiragino Sans GB W3" w:cs="Calibri"/>
           <w:b w:val="0"/>
           <w:color w:val="202020"/>
-          <w:sz w:val="19"/>
+          <w:sz w:val="17"/>
         </w:rPr>
         <w:t>原创像素风 2D 横版网页小游戏，包含森林、暮色山地、雪山冰湖三关，以及金币收集、障碍规避、踩怪和终点判定。</w:t>
       </w:r>
@@ -623,7 +559,7 @@
     <w:p>
       <w:pPr>
         <w:pStyle w:val="ListBullet"/>
-        <w:spacing w:before="0" w:after="60" w:line="269" w:lineRule="auto"/>
+        <w:spacing w:before="0" w:after="24" w:line="245" w:lineRule="auto"/>
         <w:ind w:left="360" w:hanging="173"/>
       </w:pPr>
       <w:r>
@@ -631,7 +567,7 @@
           <w:rFonts w:ascii="Calibri" w:hAnsi="Calibri" w:eastAsia="Hiragino Sans GB W3" w:cs="Calibri"/>
           <w:b w:val="0"/>
           <w:color w:val="202020"/>
-          <w:sz w:val="19"/>
+          <w:sz w:val="17"/>
         </w:rPr>
         <w:t>使用 Canvas 实现 2D 游戏画面绘制、角色移动、关卡场景和基础碰撞逻辑。</w:t>
       </w:r>
@@ -639,7 +575,7 @@
     <w:p>
       <w:pPr>
         <w:pStyle w:val="ListBullet"/>
-        <w:spacing w:before="0" w:after="60" w:line="269" w:lineRule="auto"/>
+        <w:spacing w:before="0" w:after="24" w:line="245" w:lineRule="auto"/>
         <w:ind w:left="360" w:hanging="173"/>
       </w:pPr>
       <w:r>
@@ -647,52 +583,36 @@
           <w:rFonts w:ascii="Calibri" w:hAnsi="Calibri" w:eastAsia="Hiragino Sans GB W3" w:cs="Calibri"/>
           <w:b w:val="0"/>
           <w:color w:val="202020"/>
-          <w:sz w:val="19"/>
+          <w:sz w:val="17"/>
         </w:rPr>
         <w:t>使用原生 HTML、CSS、JavaScript 完成游戏页面与交互逻辑，部署到 GitHub Pages。</w:t>
       </w:r>
     </w:p>
     <w:p>
       <w:pPr>
-        <w:pStyle w:val="ListBullet"/>
-        <w:spacing w:before="0" w:after="60" w:line="269" w:lineRule="auto"/>
-        <w:ind w:left="360" w:hanging="173"/>
-      </w:pPr>
-      <w:r>
-        <w:rPr>
-          <w:rFonts w:ascii="Calibri" w:hAnsi="Calibri" w:eastAsia="Hiragino Sans GB W3" w:cs="Calibri"/>
-          <w:b w:val="0"/>
-          <w:color w:val="202020"/>
-          <w:sz w:val="19"/>
-        </w:rPr>
-        <w:t>通过完整小游戏项目训练了交互设计、动画循环、状态管理和前端调试能力。</w:t>
-      </w:r>
-    </w:p>
-    <w:p>
-      <w:pPr>
         <w:keepNext/>
-        <w:spacing w:before="120" w:after="40" w:line="264" w:lineRule="auto"/>
+        <w:spacing w:before="60" w:after="20" w:line="264" w:lineRule="auto"/>
       </w:pPr>
       <w:r>
         <w:rPr>
           <w:rFonts w:ascii="Calibri" w:hAnsi="Calibri" w:eastAsia="Hiragino Sans GB W3" w:cs="Calibri"/>
           <w:b/>
           <w:color w:val="1F4D78"/>
-          <w:sz w:val="22"/>
+          <w:sz w:val="20"/>
         </w:rPr>
         <w:t>本地数据记录与多折线图分析工具</w:t>
       </w:r>
     </w:p>
     <w:p>
       <w:pPr>
-        <w:spacing w:before="0" w:after="40" w:line="252" w:lineRule="auto"/>
+        <w:spacing w:before="0" w:after="20" w:line="240" w:lineRule="auto"/>
       </w:pPr>
       <w:r>
         <w:rPr>
           <w:rFonts w:ascii="Calibri" w:hAnsi="Calibri" w:eastAsia="Hiragino Sans GB W3" w:cs="Calibri"/>
           <w:b/>
           <w:color w:val="595959"/>
-          <w:sz w:val="18"/>
+          <w:sz w:val="16"/>
         </w:rPr>
         <w:t>链接：</w:t>
       </w:r>
@@ -712,7 +632,7 @@
           <w:rFonts w:ascii="Calibri" w:hAnsi="Calibri" w:eastAsia="Hiragino Sans GB W3" w:cs="Calibri"/>
           <w:b w:val="0"/>
           <w:color w:val="595959"/>
-          <w:sz w:val="18"/>
+          <w:sz w:val="16"/>
         </w:rPr>
         <w:t xml:space="preserve">  |  </w:t>
       </w:r>
@@ -730,14 +650,14 @@
     </w:p>
     <w:p>
       <w:pPr>
-        <w:spacing w:before="0" w:after="40" w:line="252" w:lineRule="auto"/>
+        <w:spacing w:before="0" w:after="20" w:line="240" w:lineRule="auto"/>
       </w:pPr>
       <w:r>
         <w:rPr>
           <w:rFonts w:ascii="Calibri" w:hAnsi="Calibri" w:eastAsia="Hiragino Sans GB W3" w:cs="Calibri"/>
           <w:b/>
           <w:color w:val="595959"/>
-          <w:sz w:val="18"/>
+          <w:sz w:val="16"/>
         </w:rPr>
         <w:t>技术栈：</w:t>
       </w:r>
@@ -746,29 +666,29 @@
           <w:rFonts w:ascii="Calibri" w:hAnsi="Calibri" w:eastAsia="Hiragino Sans GB W3" w:cs="Calibri"/>
           <w:b w:val="0"/>
           <w:color w:val="595959"/>
-          <w:sz w:val="18"/>
+          <w:sz w:val="16"/>
         </w:rPr>
         <w:t>Vue 3、Vite、ECharts、Flask、SQLite、Docker、Gunicorn、Render、GitHub Actions</w:t>
       </w:r>
     </w:p>
     <w:p>
       <w:pPr>
-        <w:spacing w:before="0" w:after="60" w:line="259" w:lineRule="auto"/>
+        <w:spacing w:before="0" w:after="30" w:line="245" w:lineRule="auto"/>
       </w:pPr>
       <w:r>
         <w:rPr>
           <w:rFonts w:ascii="Calibri" w:hAnsi="Calibri" w:eastAsia="Hiragino Sans GB W3" w:cs="Calibri"/>
           <w:b w:val="0"/>
           <w:color w:val="202020"/>
-          <w:sz w:val="19"/>
+          <w:sz w:val="17"/>
         </w:rPr>
-        <w:t>用于记录和分析日期型数据的全栈 Web 应用，支持多条自定义折线、日期筛选、数据编辑、最大最小值标记、CSV/Excel 导出和图表导出。</w:t>
+        <w:t>结合数学学习和个人数据记录需求开发的多折线图分析工具，启发自日常学习、作业和健身记录，用于整理做题训练、学习进度和身体数据变化。</w:t>
       </w:r>
     </w:p>
     <w:p>
       <w:pPr>
         <w:pStyle w:val="ListBullet"/>
-        <w:spacing w:before="0" w:after="60" w:line="269" w:lineRule="auto"/>
+        <w:spacing w:before="0" w:after="24" w:line="245" w:lineRule="auto"/>
         <w:ind w:left="360" w:hanging="173"/>
       </w:pPr>
       <w:r>
@@ -776,15 +696,15 @@
           <w:rFonts w:ascii="Calibri" w:hAnsi="Calibri" w:eastAsia="Hiragino Sans GB W3" w:cs="Calibri"/>
           <w:b w:val="0"/>
           <w:color w:val="202020"/>
-          <w:sz w:val="19"/>
+          <w:sz w:val="17"/>
         </w:rPr>
-        <w:t>使用 Vue 3 和 Vite 构建前端界面，实现数据录入、编辑、筛选和交互式图表展示。</w:t>
+        <w:t>使用 Vue 3 和 ECharts 实现多条自定义折线，支持学习数据、做题记录和健身身体数据的趋势展示。</w:t>
       </w:r>
     </w:p>
     <w:p>
       <w:pPr>
         <w:pStyle w:val="ListBullet"/>
-        <w:spacing w:before="0" w:after="60" w:line="269" w:lineRule="auto"/>
+        <w:spacing w:before="0" w:after="24" w:line="245" w:lineRule="auto"/>
         <w:ind w:left="360" w:hanging="173"/>
       </w:pPr>
       <w:r>
@@ -792,15 +712,15 @@
           <w:rFonts w:ascii="Calibri" w:hAnsi="Calibri" w:eastAsia="Hiragino Sans GB W3" w:cs="Calibri"/>
           <w:b w:val="0"/>
           <w:color w:val="202020"/>
-          <w:sz w:val="19"/>
+          <w:sz w:val="17"/>
         </w:rPr>
-        <w:t>使用 ECharts 实现多折线趋势分析、最大值/最小值标记和图表导出能力。</w:t>
+        <w:t>支持日期筛选、数据编辑、最大/最小值标记、CSV/Excel 导出和图表导出，方便持续复盘。</w:t>
       </w:r>
     </w:p>
     <w:p>
       <w:pPr>
         <w:pStyle w:val="ListBullet"/>
-        <w:spacing w:before="0" w:after="60" w:line="269" w:lineRule="auto"/>
+        <w:spacing w:before="0" w:after="24" w:line="245" w:lineRule="auto"/>
         <w:ind w:left="360" w:hanging="173"/>
       </w:pPr>
       <w:r>
@@ -808,112 +728,14 @@
           <w:rFonts w:ascii="Calibri" w:hAnsi="Calibri" w:eastAsia="Hiragino Sans GB W3" w:cs="Calibri"/>
           <w:b w:val="0"/>
           <w:color w:val="202020"/>
-          <w:sz w:val="19"/>
+          <w:sz w:val="17"/>
         </w:rPr>
-        <w:t>使用 Flask 与 SQLite 搭建后端接口和数据存储逻辑，并通过 Docker、Gunicorn、Render 完成部署。</w:t>
-      </w:r>
-    </w:p>
-    <w:p>
-      <w:pPr>
-        <w:pStyle w:val="ListBullet"/>
-        <w:spacing w:before="0" w:after="60" w:line="269" w:lineRule="auto"/>
-        <w:ind w:left="360" w:hanging="173"/>
-      </w:pPr>
-      <w:r>
-        <w:rPr>
-          <w:rFonts w:ascii="Calibri" w:hAnsi="Calibri" w:eastAsia="Hiragino Sans GB W3" w:cs="Calibri"/>
-          <w:b w:val="0"/>
-          <w:color w:val="202020"/>
-          <w:sz w:val="19"/>
-        </w:rPr>
-        <w:t>完整实践了前后端分离项目的开发、部署和维护流程。</w:t>
-      </w:r>
-    </w:p>
-    <w:p>
-      <w:pPr>
-        <w:keepNext/>
-        <w:spacing w:before="200" w:after="80" w:line="264" w:lineRule="auto"/>
-        <w:pBdr>
-          <w:bottom w:val="single" w:sz="6" w:space="1" w:color="D9E2F3"/>
-        </w:pBdr>
-      </w:pPr>
-      <w:r>
-        <w:rPr>
-          <w:rFonts w:ascii="Calibri" w:hAnsi="Calibri" w:eastAsia="Hiragino Sans GB W3" w:cs="Calibri"/>
-          <w:b/>
-          <w:color w:val="2E74B5"/>
-          <w:sz w:val="26"/>
-        </w:rPr>
-        <w:t>自我评价</w:t>
-      </w:r>
-    </w:p>
-    <w:p>
-      <w:pPr>
-        <w:pStyle w:val="ListBullet"/>
-        <w:spacing w:before="0" w:after="60" w:line="269" w:lineRule="auto"/>
-        <w:ind w:left="360" w:hanging="173"/>
-      </w:pPr>
-      <w:r>
-        <w:rPr>
-          <w:rFonts w:ascii="Calibri" w:hAnsi="Calibri" w:eastAsia="Hiragino Sans GB W3" w:cs="Calibri"/>
-          <w:b w:val="0"/>
-          <w:color w:val="202020"/>
-          <w:sz w:val="19"/>
-        </w:rPr>
-        <w:t>具备数学与物理背景，逻辑分析能力较强，适合处理 AI 应用、数据分析和工程问题。</w:t>
-      </w:r>
-    </w:p>
-    <w:p>
-      <w:pPr>
-        <w:pStyle w:val="ListBullet"/>
-        <w:spacing w:before="0" w:after="60" w:line="269" w:lineRule="auto"/>
-        <w:ind w:left="360" w:hanging="173"/>
-      </w:pPr>
-      <w:r>
-        <w:rPr>
-          <w:rFonts w:ascii="Calibri" w:hAnsi="Calibri" w:eastAsia="Hiragino Sans GB W3" w:cs="Calibri"/>
-          <w:b w:val="0"/>
-          <w:color w:val="202020"/>
-          <w:sz w:val="19"/>
-        </w:rPr>
-        <w:t>有持续完成实际项目的习惯，能够从需求出发独立完成开发、部署和迭代。</w:t>
-      </w:r>
-    </w:p>
-    <w:p>
-      <w:pPr>
-        <w:pStyle w:val="ListBullet"/>
-        <w:spacing w:before="0" w:after="60" w:line="269" w:lineRule="auto"/>
-        <w:ind w:left="360" w:hanging="173"/>
-      </w:pPr>
-      <w:r>
-        <w:rPr>
-          <w:rFonts w:ascii="Calibri" w:hAnsi="Calibri" w:eastAsia="Hiragino Sans GB W3" w:cs="Calibri"/>
-          <w:b w:val="0"/>
-          <w:color w:val="202020"/>
-          <w:sz w:val="19"/>
-        </w:rPr>
-        <w:t>对 AI 应用开发、AI 游戏开发、RAG 系统和 Agent 开发保持长期学习兴趣，希望在真实业务中继续提升工程能力。</w:t>
-      </w:r>
-    </w:p>
-    <w:p>
-      <w:pPr>
-        <w:pStyle w:val="ListBullet"/>
-        <w:spacing w:before="0" w:after="60" w:line="269" w:lineRule="auto"/>
-        <w:ind w:left="360" w:hanging="173"/>
-      </w:pPr>
-      <w:r>
-        <w:rPr>
-          <w:rFonts w:ascii="Calibri" w:hAnsi="Calibri" w:eastAsia="Hiragino Sans GB W3" w:cs="Calibri"/>
-          <w:b w:val="0"/>
-          <w:color w:val="202020"/>
-          <w:sz w:val="19"/>
-        </w:rPr>
-        <w:t>目前仍在持续开发 AI 项目、游戏项目和个人作品集项目，不断通过实际项目提升工程实践能力。</w:t>
+        <w:t>使用 Flask 与 SQLite 搭建后端接口与数据存储逻辑，并通过 Docker、Gunicorn、Render 完成部署。</w:t>
       </w:r>
     </w:p>
     <w:sectPr>
       <w:pgSz w:w="12240" w:h="15840"/>
-      <w:pgMar w:top="792" w:right="1037" w:bottom="792" w:left="1037" w:header="708" w:footer="708" w:gutter="0"/>
+      <w:pgMar w:top="605" w:right="893" w:bottom="605" w:left="893" w:header="708" w:footer="708" w:gutter="0"/>
       <w:cols w:space="720"/>
       <w:docGrid w:linePitch="360"/>
     </w:sectPr>
@@ -1285,11 +1107,11 @@
     <w:qFormat/>
     <w:rsid w:val="00FC693F"/>
     <w:pPr>
-      <w:spacing w:after="80" w:line="259" w:lineRule="auto"/>
+      <w:spacing w:after="50" w:line="245" w:lineRule="auto"/>
     </w:pPr>
     <w:rPr>
       <w:rFonts w:ascii="Calibri" w:hAnsi="Calibri" w:eastAsia="Hiragino Sans GB W3" w:cs="Calibri"/>
-      <w:sz w:val="20"/>
+      <w:sz w:val="18"/>
     </w:rPr>
   </w:style>
   <w:style w:type="paragraph" w:styleId="Header">

</xml_diff>